<commit_message>
docs: publish live demo, API, and repository links
Document environment variables, deployment architecture, free-tier cold
starts, and the reviewer script; regenerate the submission document with
final URLs, verified results, and clickable links.

Co-Authored-By: Claude Opus 5 <noreply@anthropic.com>
</commit_message>
<xml_diff>
--- a/submission/TerraLens_AI_Submission.docx
+++ b/submission/TerraLens_AI_Submission.docx
@@ -26,7 +26,7 @@
         <w:t xml:space="preserve">Submission summary. </w:t>
       </w:r>
       <w:r>
-        <w:t>TerraLens AI is a completed, locally runnable full stack prototype that retrieves indexed environmental evidence and reasons across soil, water, climate, habitat, biodiversity, and human pressure. It returns measurable recommendations with explicit sources, confidence, time horizons, caveats, and a visible reasoning trace.</w:t>
+        <w:t>TerraLens AI is a completed, publicly deployed full stack prototype that retrieves indexed environmental evidence and reasons across soil, water, climate, habitat, biodiversity, and human pressure. It returns measurable recommendations with explicit sources, confidence, time horizons, caveats, and a visible reasoning trace.</w:t>
       </w:r>
     </w:p>
     <w:p>
@@ -74,6 +74,9 @@
             <w:shd w:fill="17382D"/>
           </w:tcPr>
           <w:p>
+            <w:pPr>
+              <w:keepNext/>
+            </w:pPr>
             <w:r>
               <w:rPr>
                 <w:b/>
@@ -96,12 +99,15 @@
             <w:shd w:fill="17382D"/>
           </w:tcPr>
           <w:p>
+            <w:pPr>
+              <w:keepNext/>
+            </w:pPr>
             <w:r>
               <w:rPr>
                 <w:b/>
                 <w:color w:val="FFFFFF"/>
               </w:rPr>
-              <w:t>Status and reviewer instruction</w:t>
+              <w:t>Link or reviewer instruction</w:t>
             </w:r>
           </w:p>
         </w:tc>
@@ -122,8 +128,11 @@
             </w:tcMar>
           </w:tcPr>
           <w:p>
+            <w:pPr>
+              <w:keepNext/>
+            </w:pPr>
             <w:r>
-              <w:t>GitHub repository</w:t>
+              <w:t>Live demo</w:t>
             </w:r>
           </w:p>
         </w:tc>
@@ -139,9 +148,18 @@
             </w:tcMar>
           </w:tcPr>
           <w:p>
-            <w:r>
-              <w:t>Public repository publication pending. The verified local repository is E:\Codes\TerraLens-AI.</w:t>
-            </w:r>
+            <w:pPr>
+              <w:keepNext/>
+            </w:pPr>
+            <w:hyperlink r:id="rId9">
+              <w:r>
+                <w:rPr>
+                  <w:color w:val="1F5C45"/>
+                  <w:u w:val="single"/>
+                </w:rPr>
+                <w:t>https://hmkz0x00.github.io/terralens-ai/</w:t>
+              </w:r>
+            </w:hyperlink>
           </w:p>
         </w:tc>
       </w:tr>
@@ -162,8 +180,11 @@
             <w:shd w:fill="E7EBDD"/>
           </w:tcPr>
           <w:p>
+            <w:pPr>
+              <w:keepNext/>
+            </w:pPr>
             <w:r>
-              <w:t>Live demo</w:t>
+              <w:t>GitHub repository</w:t>
             </w:r>
           </w:p>
         </w:tc>
@@ -180,9 +201,122 @@
             <w:shd w:fill="E7EBDD"/>
           </w:tcPr>
           <w:p>
+            <w:pPr>
+              <w:keepNext/>
+            </w:pPr>
+            <w:hyperlink r:id="rId10">
+              <w:r>
+                <w:rPr>
+                  <w:color w:val="1F5C45"/>
+                  <w:u w:val="single"/>
+                </w:rPr>
+                <w:t>https://github.com/Hmkz0x00/terralens-ai</w:t>
+              </w:r>
+            </w:hyperlink>
+          </w:p>
+        </w:tc>
+      </w:tr>
+      <w:tr>
+        <w:trPr>
+          <w:cantSplit/>
+        </w:trPr>
+        <w:tc>
+          <w:tcPr>
+            <w:tcW w:type="dxa" w:w="2232"/>
+            <w:vAlign w:val="center"/>
+            <w:tcMar>
+              <w:top w:w="120" w:type="dxa"/>
+              <w:left w:w="120" w:type="dxa"/>
+              <w:bottom w:w="120" w:type="dxa"/>
+              <w:right w:w="120" w:type="dxa"/>
+            </w:tcMar>
+          </w:tcPr>
+          <w:p>
+            <w:pPr>
+              <w:keepNext/>
+            </w:pPr>
             <w:r>
-              <w:t>Deployment pending. Run the complete application locally with docker compose up --build.</w:t>
+              <w:t>API documentation</w:t>
             </w:r>
+          </w:p>
+        </w:tc>
+        <w:tc>
+          <w:tcPr>
+            <w:tcW w:type="dxa" w:w="7344"/>
+            <w:vAlign w:val="center"/>
+            <w:tcMar>
+              <w:top w:w="120" w:type="dxa"/>
+              <w:left w:w="120" w:type="dxa"/>
+              <w:bottom w:w="120" w:type="dxa"/>
+              <w:right w:w="120" w:type="dxa"/>
+            </w:tcMar>
+          </w:tcPr>
+          <w:p>
+            <w:pPr>
+              <w:keepNext/>
+            </w:pPr>
+            <w:hyperlink r:id="rId11">
+              <w:r>
+                <w:rPr>
+                  <w:color w:val="1F5C45"/>
+                  <w:u w:val="single"/>
+                </w:rPr>
+                <w:t>https://terralens-ai-api.onrender.com/docs</w:t>
+              </w:r>
+            </w:hyperlink>
+          </w:p>
+        </w:tc>
+      </w:tr>
+      <w:tr>
+        <w:trPr>
+          <w:cantSplit/>
+        </w:trPr>
+        <w:tc>
+          <w:tcPr>
+            <w:tcW w:type="dxa" w:w="2232"/>
+            <w:vAlign w:val="center"/>
+            <w:tcMar>
+              <w:top w:w="120" w:type="dxa"/>
+              <w:left w:w="120" w:type="dxa"/>
+              <w:bottom w:w="120" w:type="dxa"/>
+              <w:right w:w="120" w:type="dxa"/>
+            </w:tcMar>
+            <w:shd w:fill="E7EBDD"/>
+          </w:tcPr>
+          <w:p>
+            <w:pPr>
+              <w:keepNext/>
+            </w:pPr>
+            <w:r>
+              <w:t>Backend API</w:t>
+            </w:r>
+          </w:p>
+        </w:tc>
+        <w:tc>
+          <w:tcPr>
+            <w:tcW w:type="dxa" w:w="7344"/>
+            <w:vAlign w:val="center"/>
+            <w:tcMar>
+              <w:top w:w="120" w:type="dxa"/>
+              <w:left w:w="120" w:type="dxa"/>
+              <w:bottom w:w="120" w:type="dxa"/>
+              <w:right w:w="120" w:type="dxa"/>
+            </w:tcMar>
+            <w:shd w:fill="E7EBDD"/>
+          </w:tcPr>
+          <w:p>
+            <w:pPr>
+              <w:keepNext/>
+            </w:pPr>
+            <w:hyperlink r:id="rId12">
+              <w:r>
+                <w:rPr>
+                  <w:color w:val="1F5C45"/>
+                  <w:u w:val="single"/>
+                </w:rPr>
+                <w:t>https://terralens-ai-api.onrender.com</w:t>
+              </w:r>
+            </w:hyperlink>
           </w:p>
         </w:tc>
       </w:tr>
@@ -220,48 +354,7 @@
           </w:tcPr>
           <w:p>
             <w:r>
-              <w:t>None required. The default retrieval and reasoning path works without an API key.</w:t>
-            </w:r>
-          </w:p>
-        </w:tc>
-      </w:tr>
-      <w:tr>
-        <w:trPr>
-          <w:cantSplit/>
-        </w:trPr>
-        <w:tc>
-          <w:tcPr>
-            <w:tcW w:type="dxa" w:w="2232"/>
-            <w:vAlign w:val="center"/>
-            <w:tcMar>
-              <w:top w:w="120" w:type="dxa"/>
-              <w:left w:w="120" w:type="dxa"/>
-              <w:bottom w:w="120" w:type="dxa"/>
-              <w:right w:w="120" w:type="dxa"/>
-            </w:tcMar>
-            <w:shd w:fill="E7EBDD"/>
-          </w:tcPr>
-          <w:p>
-            <w:r>
-              <w:t>API documentation</w:t>
-            </w:r>
-          </w:p>
-        </w:tc>
-        <w:tc>
-          <w:tcPr>
-            <w:tcW w:type="dxa" w:w="7344"/>
-            <w:vAlign w:val="center"/>
-            <w:tcMar>
-              <w:top w:w="120" w:type="dxa"/>
-              <w:left w:w="120" w:type="dxa"/>
-              <w:bottom w:w="120" w:type="dxa"/>
-              <w:right w:w="120" w:type="dxa"/>
-            </w:tcMar>
-            <w:shd w:fill="E7EBDD"/>
-          </w:tcPr>
-          <w:p>
-            <w:r>
-              <w:t>After startup, open http://localhost:8000/docs.</w:t>
+              <w:t>None required. No login, account, or API key is needed to use the demo or the API.</w:t>
             </w:r>
           </w:p>
         </w:tc>
@@ -273,7 +366,10 @@
         <w:rPr>
           <w:b/>
         </w:rPr>
-        <w:t>Before portal submission, replace the publication statuses above with the final GitHub and live demo URLs.</w:t>
+        <w:t xml:space="preserve">Reviewer note. </w:t>
+      </w:r>
+      <w:r>
+        <w:t>The API runs on Render's free tier, which sleeps after about 15 minutes without traffic. The first request after a pause can take up to a minute. Opening https://terralens-ai-api.onrender.com/api/health first wakes it; if a request times out, the interface keeps all inputs and the reviewer can simply run the assessment again.</w:t>
       </w:r>
     </w:p>
     <w:p>
@@ -377,6 +473,9 @@
             <w:shd w:fill="17382D"/>
           </w:tcPr>
           <w:p>
+            <w:pPr>
+              <w:keepNext/>
+            </w:pPr>
             <w:r>
               <w:rPr>
                 <w:b/>
@@ -399,6 +498,9 @@
             <w:shd w:fill="17382D"/>
           </w:tcPr>
           <w:p>
+            <w:pPr>
+              <w:keepNext/>
+            </w:pPr>
             <w:r>
               <w:rPr>
                 <w:b/>
@@ -425,6 +527,9 @@
             </w:tcMar>
           </w:tcPr>
           <w:p>
+            <w:pPr>
+              <w:keepNext/>
+            </w:pPr>
             <w:r>
               <w:t>Knowledge system</w:t>
             </w:r>
@@ -442,6 +547,9 @@
             </w:tcMar>
           </w:tcPr>
           <w:p>
+            <w:pPr>
+              <w:keepNext/>
+            </w:pPr>
             <w:r>
               <w:t>Structured evidence JSON indexed in SQLite FTS5. Retrieval ranks metric, intervention, and condition matches and returns stable source IDs and URLs.</w:t>
             </w:r>
@@ -465,6 +573,9 @@
             <w:shd w:fill="E7EBDD"/>
           </w:tcPr>
           <w:p>
+            <w:pPr>
+              <w:keepNext/>
+            </w:pPr>
             <w:r>
               <w:t>Conversational intelligence</w:t>
             </w:r>
@@ -483,6 +594,9 @@
             <w:shd w:fill="E7EBDD"/>
           </w:tcPr>
           <w:p>
+            <w:pPr>
+              <w:keepNext/>
+            </w:pPr>
             <w:r>
               <w:t>The assistant requests missing high-value variables and merges follow-up values into the same conversation session.</w:t>
             </w:r>
@@ -505,6 +619,9 @@
             </w:tcMar>
           </w:tcPr>
           <w:p>
+            <w:pPr>
+              <w:keepNext/>
+            </w:pPr>
             <w:r>
               <w:t>Evidence-backed recommendations</w:t>
             </w:r>
@@ -522,6 +639,9 @@
             </w:tcMar>
           </w:tcPr>
           <w:p>
+            <w:pPr>
+              <w:keepNext/>
+            </w:pPr>
             <w:r>
               <w:t>Every intervention contains at least one resolvable evidence ID and exposes the claim, publisher, year, and URL.</w:t>
             </w:r>
@@ -545,6 +665,9 @@
             <w:shd w:fill="E7EBDD"/>
           </w:tcPr>
           <w:p>
+            <w:pPr>
+              <w:keepNext/>
+            </w:pPr>
             <w:r>
               <w:t>Multi-metric reasoning</w:t>
             </w:r>
@@ -563,6 +686,9 @@
             <w:shd w:fill="E7EBDD"/>
           </w:tcPr>
           <w:p>
+            <w:pPr>
+              <w:keepNext/>
+            </w:pPr>
             <w:r>
               <w:t>Rules require at least three supplied variables and model compound constraints such as rainfall, carbon, and monoculture.</w:t>
             </w:r>
@@ -585,6 +711,9 @@
             </w:tcMar>
           </w:tcPr>
           <w:p>
+            <w:pPr>
+              <w:keepNext/>
+            </w:pPr>
             <w:r>
               <w:t>Input handling</w:t>
             </w:r>
@@ -602,6 +731,9 @@
             </w:tcMar>
           </w:tcPr>
           <w:p>
+            <w:pPr>
+              <w:keepNext/>
+            </w:pPr>
             <w:r>
               <w:t>Free text and typed JSON landscape profiles are supported. Missing values stay absent rather than being guessed.</w:t>
             </w:r>
@@ -753,6 +885,9 @@
             <w:shd w:fill="17382D"/>
           </w:tcPr>
           <w:p>
+            <w:pPr>
+              <w:keepNext/>
+            </w:pPr>
             <w:r>
               <w:rPr>
                 <w:b/>
@@ -775,6 +910,9 @@
             <w:shd w:fill="17382D"/>
           </w:tcPr>
           <w:p>
+            <w:pPr>
+              <w:keepNext/>
+            </w:pPr>
             <w:r>
               <w:rPr>
                 <w:b/>
@@ -801,6 +939,9 @@
             </w:tcMar>
           </w:tcPr>
           <w:p>
+            <w:pPr>
+              <w:keepNext/>
+            </w:pPr>
             <w:r>
               <w:t>id</w:t>
             </w:r>
@@ -818,6 +959,9 @@
             </w:tcMar>
           </w:tcPr>
           <w:p>
+            <w:pPr>
+              <w:keepNext/>
+            </w:pPr>
             <w:r>
               <w:t>Stable reference used by recommendations</w:t>
             </w:r>
@@ -841,6 +985,9 @@
             <w:shd w:fill="E7EBDD"/>
           </w:tcPr>
           <w:p>
+            <w:pPr>
+              <w:keepNext/>
+            </w:pPr>
             <w:r>
               <w:t>organization title year url</w:t>
             </w:r>
@@ -859,6 +1006,9 @@
             <w:shd w:fill="E7EBDD"/>
           </w:tcPr>
           <w:p>
+            <w:pPr>
+              <w:keepNext/>
+            </w:pPr>
             <w:r>
               <w:t>Human-verifiable source provenance</w:t>
             </w:r>
@@ -881,6 +1031,9 @@
             </w:tcMar>
           </w:tcPr>
           <w:p>
+            <w:pPr>
+              <w:keepNext/>
+            </w:pPr>
             <w:r>
               <w:t>claim</w:t>
             </w:r>
@@ -898,6 +1051,9 @@
             </w:tcMar>
           </w:tcPr>
           <w:p>
+            <w:pPr>
+              <w:keepNext/>
+            </w:pPr>
             <w:r>
               <w:t>Supported scientific mechanism or benchmark</w:t>
             </w:r>
@@ -921,6 +1077,9 @@
             <w:shd w:fill="E7EBDD"/>
           </w:tcPr>
           <w:p>
+            <w:pPr>
+              <w:keepNext/>
+            </w:pPr>
             <w:r>
               <w:t>metrics</w:t>
             </w:r>
@@ -939,6 +1098,9 @@
             <w:shd w:fill="E7EBDD"/>
           </w:tcPr>
           <w:p>
+            <w:pPr>
+              <w:keepNext/>
+            </w:pPr>
             <w:r>
               <w:t>Environmental outcomes linked to the claim</w:t>
             </w:r>
@@ -961,6 +1123,9 @@
             </w:tcMar>
           </w:tcPr>
           <w:p>
+            <w:pPr>
+              <w:keepNext/>
+            </w:pPr>
             <w:r>
               <w:t>interventions</w:t>
             </w:r>
@@ -978,6 +1143,9 @@
             </w:tcMar>
           </w:tcPr>
           <w:p>
+            <w:pPr>
+              <w:keepNext/>
+            </w:pPr>
             <w:r>
               <w:t>Actions supported by the record</w:t>
             </w:r>
@@ -1045,7 +1213,7 @@
         <w:pStyle w:val="ListNumber"/>
       </w:pPr>
       <w:r>
-        <w:t>Open a terminal in E:\Codes\TerraLens-AI.</w:t>
+        <w:t>Clone https://github.com/Hmkz0x00/terralens-ai and open a terminal in the repository folder.</w:t>
       </w:r>
     </w:p>
     <w:p>
@@ -1125,6 +1293,9 @@
             <w:shd w:fill="17382D"/>
           </w:tcPr>
           <w:p>
+            <w:pPr>
+              <w:keepNext/>
+            </w:pPr>
             <w:r>
               <w:rPr>
                 <w:b/>
@@ -1147,6 +1318,9 @@
             <w:shd w:fill="17382D"/>
           </w:tcPr>
           <w:p>
+            <w:pPr>
+              <w:keepNext/>
+            </w:pPr>
             <w:r>
               <w:rPr>
                 <w:b/>
@@ -1173,6 +1347,9 @@
             </w:tcMar>
           </w:tcPr>
           <w:p>
+            <w:pPr>
+              <w:keepNext/>
+            </w:pPr>
             <w:r>
               <w:t>Python environment</w:t>
             </w:r>
@@ -1190,6 +1367,9 @@
             </w:tcMar>
           </w:tcPr>
           <w:p>
+            <w:pPr>
+              <w:keepNext/>
+            </w:pPr>
             <w:r>
               <w:t>python -m venv .venv</w:t>
             </w:r>
@@ -1213,6 +1393,9 @@
             <w:shd w:fill="E7EBDD"/>
           </w:tcPr>
           <w:p>
+            <w:pPr>
+              <w:keepNext/>
+            </w:pPr>
             <w:r>
               <w:t>Backend dependencies</w:t>
             </w:r>
@@ -1231,6 +1414,9 @@
             <w:shd w:fill="E7EBDD"/>
           </w:tcPr>
           <w:p>
+            <w:pPr>
+              <w:keepNext/>
+            </w:pPr>
             <w:r>
               <w:t>.venv/Scripts/python -m pip install -r backend/requirements-dev.txt</w:t>
             </w:r>
@@ -1253,6 +1439,9 @@
             </w:tcMar>
           </w:tcPr>
           <w:p>
+            <w:pPr>
+              <w:keepNext/>
+            </w:pPr>
             <w:r>
               <w:t>Start API</w:t>
             </w:r>
@@ -1270,6 +1459,9 @@
             </w:tcMar>
           </w:tcPr>
           <w:p>
+            <w:pPr>
+              <w:keepNext/>
+            </w:pPr>
             <w:r>
               <w:t>.venv/Scripts/python -m uvicorn app.main:app --app-dir backend --reload</w:t>
             </w:r>
@@ -1293,6 +1485,9 @@
             <w:shd w:fill="E7EBDD"/>
           </w:tcPr>
           <w:p>
+            <w:pPr>
+              <w:keepNext/>
+            </w:pPr>
             <w:r>
               <w:t>Frontend dependencies</w:t>
             </w:r>
@@ -1311,6 +1506,9 @@
             <w:shd w:fill="E7EBDD"/>
           </w:tcPr>
           <w:p>
+            <w:pPr>
+              <w:keepNext/>
+            </w:pPr>
             <w:r>
               <w:t>cd frontend then pnpm install</w:t>
             </w:r>
@@ -1403,6 +1601,9 @@
             <w:shd w:fill="17382D"/>
           </w:tcPr>
           <w:p>
+            <w:pPr>
+              <w:keepNext/>
+            </w:pPr>
             <w:r>
               <w:rPr>
                 <w:b/>
@@ -1425,6 +1626,9 @@
             <w:shd w:fill="17382D"/>
           </w:tcPr>
           <w:p>
+            <w:pPr>
+              <w:keepNext/>
+            </w:pPr>
             <w:r>
               <w:rPr>
                 <w:b/>
@@ -1451,6 +1655,9 @@
             </w:tcMar>
           </w:tcPr>
           <w:p>
+            <w:pPr>
+              <w:keepNext/>
+            </w:pPr>
             <w:r>
               <w:t>Backend</w:t>
             </w:r>
@@ -1468,8 +1675,11 @@
             </w:tcMar>
           </w:tcPr>
           <w:p>
+            <w:pPr>
+              <w:keepNext/>
+            </w:pPr>
             <w:r>
-              <w:t>21 pytest cases passed; Ruff reported all checks passed.</w:t>
+              <w:t>26 pytest cases passed; Ruff reported all checks passed.</w:t>
             </w:r>
           </w:p>
         </w:tc>
@@ -1491,6 +1701,9 @@
             <w:shd w:fill="E7EBDD"/>
           </w:tcPr>
           <w:p>
+            <w:pPr>
+              <w:keepNext/>
+            </w:pPr>
             <w:r>
               <w:t>Frontend</w:t>
             </w:r>
@@ -1509,8 +1722,11 @@
             <w:shd w:fill="E7EBDD"/>
           </w:tcPr>
           <w:p>
+            <w:pPr>
+              <w:keepNext/>
+            </w:pPr>
             <w:r>
-              <w:t>4 Vitest cases passed; TypeScript compilation and ESLint completed without errors.</w:t>
+              <w:t>7 Vitest cases passed; TypeScript compilation and ESLint completed without errors.</w:t>
             </w:r>
           </w:p>
         </w:tc>
@@ -1531,6 +1747,9 @@
             </w:tcMar>
           </w:tcPr>
           <w:p>
+            <w:pPr>
+              <w:keepNext/>
+            </w:pPr>
             <w:r>
               <w:t>Production build</w:t>
             </w:r>
@@ -1548,6 +1767,9 @@
             </w:tcMar>
           </w:tcPr>
           <w:p>
+            <w:pPr>
+              <w:keepNext/>
+            </w:pPr>
             <w:r>
               <w:t>Vite created the optimized production bundle.</w:t>
             </w:r>
@@ -1571,8 +1793,11 @@
             <w:shd w:fill="E7EBDD"/>
           </w:tcPr>
           <w:p>
+            <w:pPr>
+              <w:keepNext/>
+            </w:pPr>
             <w:r>
-              <w:t>Browser workflow</w:t>
+              <w:t>Deployed API</w:t>
             </w:r>
           </w:p>
         </w:tc>
@@ -1589,8 +1814,11 @@
             <w:shd w:fill="E7EBDD"/>
           </w:tcPr>
           <w:p>
+            <w:pPr>
+              <w:keepNext/>
+            </w:pPr>
             <w:r>
-              <w:t>Live semi-arid assessment and recoverable API failure paths passed.</w:t>
+              <w:t>Health, scenarios, documentation, clarification, merged follow-up assessment, invalid input rejection, session reset, and the CORS allowlist were verified over HTTPS.</w:t>
             </w:r>
           </w:p>
         </w:tc>
@@ -1611,6 +1839,55 @@
             </w:tcMar>
           </w:tcPr>
           <w:p>
+            <w:pPr>
+              <w:keepNext/>
+            </w:pPr>
+            <w:r>
+              <w:t>Browser workflow</w:t>
+            </w:r>
+          </w:p>
+        </w:tc>
+        <w:tc>
+          <w:tcPr>
+            <w:tcW w:type="dxa" w:w="7272"/>
+            <w:vAlign w:val="center"/>
+            <w:tcMar>
+              <w:top w:w="120" w:type="dxa"/>
+              <w:left w:w="120" w:type="dxa"/>
+              <w:bottom w:w="120" w:type="dxa"/>
+              <w:right w:w="120" w:type="dxa"/>
+            </w:tcMar>
+          </w:tcPr>
+          <w:p>
+            <w:pPr>
+              <w:keepNext/>
+            </w:pPr>
+            <w:r>
+              <w:t>On the live demo and locally: sample assessment, clarification then multi-turn follow-up, evidence links, reasoning trace, and recovery from HTTP 503 and an unreachable API passed with no console errors or failed requests.</w:t>
+            </w:r>
+          </w:p>
+        </w:tc>
+      </w:tr>
+      <w:tr>
+        <w:trPr>
+          <w:cantSplit/>
+        </w:trPr>
+        <w:tc>
+          <w:tcPr>
+            <w:tcW w:type="dxa" w:w="2304"/>
+            <w:vAlign w:val="center"/>
+            <w:tcMar>
+              <w:top w:w="120" w:type="dxa"/>
+              <w:left w:w="120" w:type="dxa"/>
+              <w:bottom w:w="120" w:type="dxa"/>
+              <w:right w:w="120" w:type="dxa"/>
+            </w:tcMar>
+            <w:shd w:fill="E7EBDD"/>
+          </w:tcPr>
+          <w:p>
+            <w:pPr>
+              <w:keepNext/>
+            </w:pPr>
             <w:r>
               <w:t>Accessibility</w:t>
             </w:r>
@@ -1626,10 +1903,59 @@
               <w:bottom w:w="120" w:type="dxa"/>
               <w:right w:w="120" w:type="dxa"/>
             </w:tcMar>
+            <w:shd w:fill="E7EBDD"/>
           </w:tcPr>
           <w:p>
+            <w:pPr>
+              <w:keepNext/>
+            </w:pPr>
             <w:r>
               <w:t>No serious or critical axe violations; keyboard focus remained visible.</w:t>
+            </w:r>
+          </w:p>
+        </w:tc>
+      </w:tr>
+      <w:tr>
+        <w:trPr>
+          <w:cantSplit/>
+        </w:trPr>
+        <w:tc>
+          <w:tcPr>
+            <w:tcW w:type="dxa" w:w="2304"/>
+            <w:vAlign w:val="center"/>
+            <w:tcMar>
+              <w:top w:w="120" w:type="dxa"/>
+              <w:left w:w="120" w:type="dxa"/>
+              <w:bottom w:w="120" w:type="dxa"/>
+              <w:right w:w="120" w:type="dxa"/>
+            </w:tcMar>
+          </w:tcPr>
+          <w:p>
+            <w:pPr>
+              <w:keepNext/>
+            </w:pPr>
+            <w:r>
+              <w:t>Responsive layout</w:t>
+            </w:r>
+          </w:p>
+        </w:tc>
+        <w:tc>
+          <w:tcPr>
+            <w:tcW w:type="dxa" w:w="7272"/>
+            <w:vAlign w:val="center"/>
+            <w:tcMar>
+              <w:top w:w="120" w:type="dxa"/>
+              <w:left w:w="120" w:type="dxa"/>
+              <w:bottom w:w="120" w:type="dxa"/>
+              <w:right w:w="120" w:type="dxa"/>
+            </w:tcMar>
+          </w:tcPr>
+          <w:p>
+            <w:pPr>
+              <w:keepNext/>
+            </w:pPr>
+            <w:r>
+              <w:t>No horizontal overflow at 1440 by 900 or 390 by 844.</w:t>
             </w:r>
           </w:p>
         </w:tc>
@@ -1652,7 +1978,7 @@
           </w:tcPr>
           <w:p>
             <w:r>
-              <w:t>Responsive layout</w:t>
+              <w:t>Continuous integration</w:t>
             </w:r>
           </w:p>
         </w:tc>
@@ -1670,7 +1996,7 @@
           </w:tcPr>
           <w:p>
             <w:r>
-              <w:t>No horizontal overflow at 1440 by 900 or 390 by 844.</w:t>
+              <w:t>GitHub Actions CI and the GitHub Pages deployment passed on the final commit.</w:t>
             </w:r>
           </w:p>
         </w:tc>
@@ -1687,7 +2013,7 @@
     </w:p>
     <w:p>
       <w:r>
-        <w:t>The GitHub Actions workflow installs pinned dependencies, runs backend tests and lint, runs frontend unit tests and lint, and creates a production build. Separate backend and frontend Dockerfiles support container deployment, while Docker Compose provides the fastest reviewer path. The frontend API base URL is configurable at build time.</w:t>
+        <w:t>GitHub Actions runs backend tests and lint, frontend unit tests and lint, and a production build on every push. A second workflow builds the frontend with the production API URL and publishes it to GitHub Pages. The backend is a Render Blueprint (render.yaml) for a free Docker web service that runs as a non-root user, binds to the platform port, and redeploys automatically from the main branch. CORS allows only the GitHub Pages origin and local development origins, and unexpected server errors return a generic message without internal details. Docker Compose remains the fastest local reviewer path.</w:t>
       </w:r>
     </w:p>
     <w:p>
@@ -1727,7 +2053,15 @@
         <w:pStyle w:val="ListBullet"/>
       </w:pPr>
       <w:r>
-        <w:t>Sessions are held in process memory; production use should move them to durable storage.</w:t>
+        <w:t>Sessions are held in process memory; on the free hosted tier they reset when the service sleeps or redeploys.</w:t>
+      </w:r>
+    </w:p>
+    <w:p>
+      <w:pPr>
+        <w:pStyle w:val="ListBullet"/>
+      </w:pPr>
+      <w:r>
+        <w:t>The free hosting tier adds a cold start of up to about a minute after inactivity.</w:t>
       </w:r>
     </w:p>
     <w:p>
@@ -1748,11 +2082,11 @@
     </w:p>
     <w:p>
       <w:r>
-        <w:t>Run the semi-arid case, inspect the compound recommendations and their metric impacts, expand the reasoning trace, and open an IPCC or FAO source. Then start a new case with only land use to verify that the system asks a targeted clarification instead of producing an unsupported generic answer.</w:t>
+        <w:t>Open https://hmkz0x00.github.io/terralens-ai/. Run the semi-arid case, inspect the compound recommendations and their metric impacts, expand the reasoning trace, and open an IPCC or FAO source. Then start a new case with only land use to verify that the system asks a targeted clarification instead of producing an unsupported generic answer; adding the requested values continues the same session to a full assessment.</w:t>
       </w:r>
     </w:p>
     <w:sectPr>
-      <w:footerReference w:type="default" r:id="rId9"/>
+      <w:footerReference w:type="default" r:id="rId13"/>
       <w:pgSz w:w="12240" w:h="15840"/>
       <w:pgMar w:top="1037" w:right="1181" w:bottom="1037" w:left="1181" w:header="720" w:footer="720" w:gutter="0"/>
       <w:cols w:space="720"/>

</xml_diff>

<commit_message>
docs: point links at the krishn1301 repository and Pages site
Co-Authored-By: Claude Opus 5 <noreply@anthropic.com>
Claude-Session: https://claude.ai/code/session_01DZhy5qFiVhsaRodaXfCNuh
</commit_message>
<xml_diff>
--- a/submission/TerraLens_AI_Submission.docx
+++ b/submission/TerraLens_AI_Submission.docx
@@ -157,7 +157,7 @@
                   <w:color w:val="1F5C45"/>
                   <w:u w:val="single"/>
                 </w:rPr>
-                <w:t>https://hmkz0x00.github.io/terralens-ai/</w:t>
+                <w:t>https://krishn1301.github.io/terralens-ai/</w:t>
               </w:r>
             </w:hyperlink>
           </w:p>
@@ -210,7 +210,7 @@
                   <w:color w:val="1F5C45"/>
                   <w:u w:val="single"/>
                 </w:rPr>
-                <w:t>https://github.com/Hmkz0x00/terralens-ai</w:t>
+                <w:t>https://github.com/krishn1301/terralens-ai</w:t>
               </w:r>
             </w:hyperlink>
           </w:p>
@@ -1213,7 +1213,7 @@
         <w:pStyle w:val="ListNumber"/>
       </w:pPr>
       <w:r>
-        <w:t>Clone https://github.com/Hmkz0x00/terralens-ai and open a terminal in the repository folder.</w:t>
+        <w:t>Clone https://github.com/krishn1301/terralens-ai and open a terminal in the repository folder.</w:t>
       </w:r>
     </w:p>
     <w:p>
@@ -2082,7 +2082,7 @@
     </w:p>
     <w:p>
       <w:r>
-        <w:t>Open https://hmkz0x00.github.io/terralens-ai/. Run the semi-arid case, inspect the compound recommendations and their metric impacts, expand the reasoning trace, and open an IPCC or FAO source. Then start a new case with only land use to verify that the system asks a targeted clarification instead of producing an unsupported generic answer; adding the requested values continues the same session to a full assessment.</w:t>
+        <w:t>Open https://krishn1301.github.io/terralens-ai/. Run the semi-arid case, inspect the compound recommendations and their metric impacts, expand the reasoning trace, and open an IPCC or FAO source. Then start a new case with only land use to verify that the system asks a targeted clarification instead of producing an unsupported generic answer; adding the requested values continues the same session to a full assessment.</w:t>
       </w:r>
     </w:p>
     <w:sectPr>

</xml_diff>